<commit_message>
Logisim devient Simulog : pastille d'accueil, retour « ← SIMULOG », docs et trames Word
La rubrique des environnements d'entreprise s'appelle désormais Simulog,
comme le site s'appelle Prepalog. Aucune donnée d'élève touchée : l'identifiant
de rubrique n'est enregistré nulle part. Trames Word et corrigés régénérés ;
les PDF restent à refaire depuis les Word.

Co-Authored-By: Claude Opus 5.5 <noreply@anthropic.com>
</commit_message>
<xml_diff>
--- a/contenus/trames/ENT-1.1-spartoo-reception-trame-eleve.docx
+++ b/contenus/trames/ENT-1.1-spartoo-reception-trame-eleve.docx
@@ -49,7 +49,7 @@
           <w:color w:val="111111"/>
           <w:sz w:val="40"/>
         </w:rPr>
-        <w:t xml:space="preserve">  Logisim</w:t>
+        <w:t xml:space="preserve">  Simulog</w:t>
       </w:r>
       <w:r>
         <w:tab/>
@@ -2076,7 +2076,7 @@
           <w:color w:val="1A1A1A"/>
           <w:sz w:val="22"/>
         </w:rPr>
-        <w:t>Connecte-toi à Prepalog, ouvre la rubrique Logisim puis l'activité « Spartoo — réception ». Tu arrives dans le logiciel de l'entreprise. Va dans Messagerie : M. Morin, ton responsable, t'a écrit.</w:t>
+        <w:t>Connecte-toi à Prepalog, ouvre la rubrique Simulog puis l'activité « Spartoo — réception ». Tu arrives dans le logiciel de l'entreprise. Va dans Messagerie : M. Morin, ton responsable, t'a écrit.</w:t>
       </w:r>
     </w:p>
     <w:p>

</xml_diff>

<commit_message>
Trames élève : reprise de l'audit, ENT-3.2 et 3.3, feuilles à détacher, PDF regénérés
Travail de Cowork (brief COWORK-reprise-trames), relu et branché :
- trames d'ENT-3.2 et ENT-3.3 déclarées (trame et corrigé visibles côté enseignant) ;
- feuille à détacher (cours à trous, « À la maison ») à la fin de chaque trame ;
- corrigés : le message modèle de la réponse à Inès (ENT-3.3) s'affiche enfin,
  les tableaux donnés de « À la maison » ne sont plus listés comme réponses vides.

Co-Authored-By: Claude Opus 5.5 <noreply@anthropic.com>
</commit_message>
<xml_diff>
--- a/contenus/trames/ENT-1.1-spartoo-reception-trame-eleve.docx
+++ b/contenus/trames/ENT-1.1-spartoo-reception-trame-eleve.docx
@@ -303,7 +303,101 @@
               <w:rPr>
                 <w:sz w:val="20"/>
               </w:rPr>
-              <w:t>il se complète étape par étape, au fil de la séance. Aujourd'hui, tu es au quai de réception de Spartoo : une livraison arrive, et c'est toi qui la contrôles. Le logiciel ne compte rien à ta place et ne corrige aucune erreur — ce que tu saisis entre vraiment dans le stock. Ton enseignant voit dans son suivi de classe si le travail est fait correctement.</w:t>
+              <w:t>tu peux le suivre seul, étape par étape. Aujourd'hui, tu es au quai de réception de Spartoo : une livraison arrive, et c'est toi qui la contrôles. Le logiciel ne compte rien à ta place et ne corrige aucune erreur : ce que tu saisis entre vraiment dans le stock.</w:t>
+            </w:r>
+          </w:p>
+        </w:tc>
+      </w:tr>
+    </w:tbl>
+    <w:p>
+      <w:pPr>
+        <w:keepNext/>
+        <w:spacing w:after="40"/>
+      </w:pPr>
+    </w:p>
+    <w:tbl>
+      <w:tblPr>
+        <w:tblStyle w:val="TableGrid"/>
+        <w:tblW w:type="auto" w:w="0"/>
+        <w:jc w:val="left"/>
+        <w:tblLook w:firstColumn="1" w:firstRow="1" w:lastColumn="0" w:lastRow="0" w:noHBand="0" w:noVBand="1" w:val="04A0"/>
+      </w:tblPr>
+      <w:tblGrid>
+        <w:gridCol w:w="10086"/>
+      </w:tblGrid>
+      <w:tr>
+        <w:trPr>
+          <w:cantSplit/>
+        </w:trPr>
+        <w:tc>
+          <w:tcPr>
+            <w:tcW w:type="dxa" w:w="10086"/>
+            <w:shd w:fill="F2F2F2"/>
+          </w:tcPr>
+          <w:p>
+            <w:pPr>
+              <w:spacing w:after="0"/>
+            </w:pPr>
+            <w:r>
+              <w:rPr>
+                <w:b/>
+                <w:color w:val="111111"/>
+                <w:sz w:val="20"/>
+              </w:rPr>
+              <w:t xml:space="preserve">Ce que ton enseignant voit dans son suivi : </w:t>
+            </w:r>
+            <w:r>
+              <w:rPr>
+                <w:sz w:val="20"/>
+              </w:rPr>
+              <w:t>trois points : ton contrôle à réception (numéro de lot, quantités, état et décision de chaque ligne), l'entrée en stock avec le bon lot, et ton message de réserves à Puma. Tes réponses écrites ici servent à réfléchir.</w:t>
+            </w:r>
+          </w:p>
+        </w:tc>
+      </w:tr>
+    </w:tbl>
+    <w:p>
+      <w:pPr>
+        <w:keepNext/>
+        <w:spacing w:after="40"/>
+      </w:pPr>
+    </w:p>
+    <w:tbl>
+      <w:tblPr>
+        <w:tblStyle w:val="TableGrid"/>
+        <w:tblW w:type="auto" w:w="0"/>
+        <w:jc w:val="left"/>
+        <w:tblLook w:firstColumn="1" w:firstRow="1" w:lastColumn="0" w:lastRow="0" w:noHBand="0" w:noVBand="1" w:val="04A0"/>
+      </w:tblPr>
+      <w:tblGrid>
+        <w:gridCol w:w="10086"/>
+      </w:tblGrid>
+      <w:tr>
+        <w:trPr>
+          <w:cantSplit/>
+        </w:trPr>
+        <w:tc>
+          <w:tcPr>
+            <w:tcW w:type="dxa" w:w="10086"/>
+            <w:shd w:fill="F2F2F2"/>
+          </w:tcPr>
+          <w:p>
+            <w:pPr>
+              <w:spacing w:after="0"/>
+            </w:pPr>
+            <w:r>
+              <w:rPr>
+                <w:b/>
+                <w:color w:val="111111"/>
+                <w:sz w:val="20"/>
+              </w:rPr>
+              <w:t xml:space="preserve">Ce qui est vrai, ce qui est inventé : </w:t>
+            </w:r>
+            <w:r>
+              <w:rPr>
+                <w:sz w:val="20"/>
+              </w:rPr>
+              <w:t>Spartoo, son métier (la vente de chaussures en ligne) et la marque Puma sont réels. Le bon de livraison, les quantités, les numéros, les coordonnées de Puma et M. Morin sont inventés pour l'exercice.</w:t>
             </w:r>
           </w:p>
         </w:tc>
@@ -1845,6 +1939,53 @@
       <w:tblPr>
         <w:tblStyle w:val="TableGrid"/>
         <w:tblW w:type="auto" w:w="0"/>
+        <w:jc w:val="left"/>
+        <w:tblLook w:firstColumn="1" w:firstRow="1" w:lastColumn="0" w:lastRow="0" w:noHBand="0" w:noVBand="1" w:val="04A0"/>
+      </w:tblPr>
+      <w:tblGrid>
+        <w:gridCol w:w="10086"/>
+      </w:tblGrid>
+      <w:tr>
+        <w:trPr>
+          <w:cantSplit/>
+        </w:trPr>
+        <w:tc>
+          <w:tcPr>
+            <w:tcW w:type="dxa" w:w="10086"/>
+            <w:shd w:fill="F2F2F2"/>
+          </w:tcPr>
+          <w:p>
+            <w:pPr>
+              <w:spacing w:after="0"/>
+            </w:pPr>
+            <w:r>
+              <w:rPr>
+                <w:b/>
+                <w:color w:val="111111"/>
+                <w:sz w:val="20"/>
+              </w:rPr>
+              <w:t xml:space="preserve">Deux destinataires : </w:t>
+            </w:r>
+            <w:r>
+              <w:rPr>
+                <w:sz w:val="20"/>
+              </w:rPr>
+              <w:t>les réserves se confirment au transporteur, qui a apporté la marchandise. On prévient aussi le fournisseur : c'est lui qui doit livrer ce qui a été commandé.</w:t>
+            </w:r>
+          </w:p>
+        </w:tc>
+      </w:tr>
+    </w:tbl>
+    <w:p>
+      <w:pPr>
+        <w:keepNext/>
+        <w:spacing w:after="40"/>
+      </w:pPr>
+    </w:p>
+    <w:tbl>
+      <w:tblPr>
+        <w:tblStyle w:val="TableGrid"/>
+        <w:tblW w:type="auto" w:w="0"/>
         <w:tblLook w:firstColumn="1" w:firstRow="1" w:lastColumn="0" w:lastRow="0" w:noHBand="0" w:noVBand="1" w:val="04A0"/>
       </w:tblPr>
       <w:tblGrid>
@@ -2482,7 +2623,6 @@
     </w:tbl>
     <w:p>
       <w:pPr>
-        <w:keepNext/>
         <w:spacing w:after="0" w:line="60" w:lineRule="exact"/>
       </w:pPr>
       <w:r>
@@ -2490,52 +2630,6 @@
           <w:sz w:val="10"/>
         </w:rPr>
       </w:r>
-    </w:p>
-    <w:tbl>
-      <w:tblPr>
-        <w:tblStyle w:val="TableGrid"/>
-        <w:tblW w:type="auto" w:w="0"/>
-        <w:jc w:val="left"/>
-        <w:tblLook w:firstColumn="1" w:firstRow="1" w:lastColumn="0" w:lastRow="0" w:noHBand="0" w:noVBand="1" w:val="04A0"/>
-      </w:tblPr>
-      <w:tblGrid>
-        <w:gridCol w:w="10086"/>
-      </w:tblGrid>
-      <w:tr>
-        <w:trPr>
-          <w:cantSplit/>
-        </w:trPr>
-        <w:tc>
-          <w:tcPr>
-            <w:tcW w:type="dxa" w:w="10086"/>
-            <w:shd w:fill="F2F2F2"/>
-          </w:tcPr>
-          <w:p>
-            <w:pPr>
-              <w:spacing w:after="0"/>
-            </w:pPr>
-            <w:r>
-              <w:rPr>
-                <w:b/>
-                <w:color w:val="111111"/>
-                <w:sz w:val="20"/>
-              </w:rPr>
-              <w:t xml:space="preserve">Retiens bien la règle : </w:t>
-            </w:r>
-            <w:r>
-              <w:rPr>
-                <w:sz w:val="20"/>
-              </w:rPr>
-              <w:t>dès qu'il y a un écart de quantité OU un carton endommagé, la ligne est « acceptée sous réserve ». On l'entre quand même en stock, et on prévient le fournisseur le jour même.</w:t>
-            </w:r>
-          </w:p>
-        </w:tc>
-      </w:tr>
-    </w:tbl>
-    <w:p>
-      <w:pPr>
-        <w:spacing w:after="40"/>
-      </w:pPr>
     </w:p>
     <w:p>
       <w:pPr>
@@ -2655,7 +2749,17 @@
           <w:tcPr>
             <w:tcW w:type="dxa" w:w="3628"/>
           </w:tcPr>
-          <w:p/>
+          <w:p>
+            <w:pPr>
+              <w:spacing w:after="0"/>
+            </w:pPr>
+            <w:r>
+              <w:rPr>
+                <w:sz w:val="20"/>
+              </w:rPr>
+              <w:t>Numéro du bon de livraison</w:t>
+            </w:r>
+          </w:p>
         </w:tc>
         <w:tc>
           <w:tcPr>
@@ -2672,7 +2776,17 @@
           <w:tcPr>
             <w:tcW w:type="dxa" w:w="3628"/>
           </w:tcPr>
-          <w:p/>
+          <w:p>
+            <w:pPr>
+              <w:spacing w:after="0"/>
+            </w:pPr>
+            <w:r>
+              <w:rPr>
+                <w:sz w:val="20"/>
+              </w:rPr>
+              <w:t>Date d'expédition</w:t>
+            </w:r>
+          </w:p>
         </w:tc>
         <w:tc>
           <w:tcPr>
@@ -2689,7 +2803,17 @@
           <w:tcPr>
             <w:tcW w:type="dxa" w:w="3628"/>
           </w:tcPr>
-          <w:p/>
+          <w:p>
+            <w:pPr>
+              <w:spacing w:after="0"/>
+            </w:pPr>
+            <w:r>
+              <w:rPr>
+                <w:sz w:val="20"/>
+              </w:rPr>
+              <w:t>Transporteur</w:t>
+            </w:r>
+          </w:p>
         </w:tc>
         <w:tc>
           <w:tcPr>
@@ -2706,7 +2830,17 @@
           <w:tcPr>
             <w:tcW w:type="dxa" w:w="3628"/>
           </w:tcPr>
-          <w:p/>
+          <w:p>
+            <w:pPr>
+              <w:spacing w:after="0"/>
+            </w:pPr>
+            <w:r>
+              <w:rPr>
+                <w:sz w:val="20"/>
+              </w:rPr>
+              <w:t>Numéro de lot</w:t>
+            </w:r>
+          </w:p>
         </w:tc>
         <w:tc>
           <w:tcPr>
@@ -2723,7 +2857,17 @@
           <w:tcPr>
             <w:tcW w:type="dxa" w:w="3628"/>
           </w:tcPr>
-          <w:p/>
+          <w:p>
+            <w:pPr>
+              <w:spacing w:after="0"/>
+            </w:pPr>
+            <w:r>
+              <w:rPr>
+                <w:sz w:val="20"/>
+              </w:rPr>
+              <w:t>Nombre total de paires annoncées</w:t>
+            </w:r>
+          </w:p>
         </w:tc>
         <w:tc>
           <w:tcPr>
@@ -2737,19 +2881,6 @@
       <w:pPr>
         <w:spacing w:after="40"/>
       </w:pPr>
-    </w:p>
-    <w:p>
-      <w:pPr>
-        <w:spacing w:before="0" w:after="160"/>
-      </w:pPr>
-      <w:r>
-        <w:rPr>
-          <w:b w:val="0"/>
-          <w:color w:val="1A1A1A"/>
-          <w:sz w:val="19"/>
-        </w:rPr>
-        <w:t>Dans la colonne de gauche, écris : numéro du bon de livraison — date d'expédition — transporteur — numéro de lot — nombre total de paires annoncées.</w:t>
-      </w:r>
     </w:p>
     <w:p>
       <w:pPr>
@@ -3438,6 +3569,86 @@
       <w:tblPr>
         <w:tblStyle w:val="TableGrid"/>
         <w:tblW w:type="auto" w:w="0"/>
+        <w:jc w:val="left"/>
+        <w:tblLook w:firstColumn="1" w:firstRow="1" w:lastColumn="0" w:lastRow="0" w:noHBand="0" w:noVBand="1" w:val="04A0"/>
+      </w:tblPr>
+      <w:tblGrid>
+        <w:gridCol w:w="10086"/>
+      </w:tblGrid>
+      <w:tr>
+        <w:trPr>
+          <w:cantSplit/>
+        </w:trPr>
+        <w:tc>
+          <w:tcPr>
+            <w:tcW w:type="dxa" w:w="10086"/>
+            <w:shd w:fill="F2F2F2"/>
+          </w:tcPr>
+          <w:p>
+            <w:pPr>
+              <w:keepNext/>
+              <w:spacing w:after="40"/>
+            </w:pPr>
+            <w:r>
+              <w:rPr>
+                <w:b/>
+                <w:color w:val="111111"/>
+                <w:sz w:val="20"/>
+              </w:rPr>
+              <w:t>Ce que tu dois voir :</w:t>
+            </w:r>
+          </w:p>
+          <w:p>
+            <w:pPr>
+              <w:keepNext/>
+              <w:spacing w:before="0" w:after="40"/>
+              <w:ind w:left="397" w:hanging="227"/>
+            </w:pPr>
+            <w:r>
+              <w:rPr>
+                <w:sz w:val="20"/>
+              </w:rPr>
+              <w:t>•  en haut, le fournisseur, le transporteur et le bon de livraison de la réception ;</w:t>
+            </w:r>
+          </w:p>
+          <w:p>
+            <w:pPr>
+              <w:keepNext/>
+              <w:spacing w:before="0" w:after="40"/>
+              <w:ind w:left="397" w:hanging="227"/>
+            </w:pPr>
+            <w:r>
+              <w:rPr>
+                <w:sz w:val="20"/>
+              </w:rPr>
+              <w:t>•  le tableau « Colis reçus sur le quai » : une ligne par colis, avec son contenu et l'état du carton ;</w:t>
+            </w:r>
+          </w:p>
+          <w:p>
+            <w:pPr>
+              <w:spacing w:before="0" w:after="0"/>
+              <w:ind w:left="397" w:hanging="227"/>
+            </w:pPr>
+            <w:r>
+              <w:rPr>
+                <w:sz w:val="20"/>
+              </w:rPr>
+              <w:t>•  plus bas, le « Bon de réception », encore vide : tu le rempliras à l'étape 6.</w:t>
+            </w:r>
+          </w:p>
+        </w:tc>
+      </w:tr>
+    </w:tbl>
+    <w:p>
+      <w:pPr>
+        <w:keepNext/>
+        <w:spacing w:after="40"/>
+      </w:pPr>
+    </w:p>
+    <w:tbl>
+      <w:tblPr>
+        <w:tblStyle w:val="TableGrid"/>
+        <w:tblW w:type="auto" w:w="0"/>
         <w:tblLayout w:type="fixed"/>
         <w:tblLook w:firstColumn="1" w:firstRow="1" w:lastColumn="0" w:lastRow="0" w:noHBand="0" w:noVBand="1" w:val="04A0"/>
       </w:tblPr>
@@ -3860,6 +4071,7 @@
     </w:p>
     <w:p>
       <w:pPr>
+        <w:keepNext/>
         <w:spacing w:after="80"/>
         <w:ind w:left="454" w:hanging="454"/>
       </w:pPr>
@@ -3877,6 +4089,72 @@
         </w:rPr>
         <w:t>Vérifie ta saisie ligne par ligne avant de valider : après validation, tu ne peux plus la modifier.</w:t>
       </w:r>
+    </w:p>
+    <w:tbl>
+      <w:tblPr>
+        <w:tblStyle w:val="TableGrid"/>
+        <w:tblW w:type="auto" w:w="0"/>
+        <w:jc w:val="left"/>
+        <w:tblLook w:firstColumn="1" w:firstRow="1" w:lastColumn="0" w:lastRow="0" w:noHBand="0" w:noVBand="1" w:val="04A0"/>
+      </w:tblPr>
+      <w:tblGrid>
+        <w:gridCol w:w="10086"/>
+      </w:tblGrid>
+      <w:tr>
+        <w:trPr>
+          <w:cantSplit/>
+        </w:trPr>
+        <w:tc>
+          <w:tcPr>
+            <w:tcW w:type="dxa" w:w="10086"/>
+            <w:shd w:fill="F2F2F2"/>
+          </w:tcPr>
+          <w:p>
+            <w:pPr>
+              <w:keepNext/>
+              <w:spacing w:after="40"/>
+            </w:pPr>
+            <w:r>
+              <w:rPr>
+                <w:b/>
+                <w:color w:val="111111"/>
+                <w:sz w:val="20"/>
+              </w:rPr>
+              <w:t>Ce que tu dois voir :</w:t>
+            </w:r>
+          </w:p>
+          <w:p>
+            <w:pPr>
+              <w:keepNext/>
+              <w:spacing w:before="0" w:after="40"/>
+              <w:ind w:left="397" w:hanging="227"/>
+            </w:pPr>
+            <w:r>
+              <w:rPr>
+                <w:sz w:val="20"/>
+              </w:rPr>
+              <w:t>•  le bouton « Valider la réception (entrée en stock) » reste gris tant que le numéro de lot et toutes les lignes ne sont pas remplis ;</w:t>
+            </w:r>
+          </w:p>
+          <w:p>
+            <w:pPr>
+              <w:spacing w:before="0" w:after="0"/>
+              <w:ind w:left="397" w:hanging="227"/>
+            </w:pPr>
+            <w:r>
+              <w:rPr>
+                <w:sz w:val="20"/>
+              </w:rPr>
+              <w:t>•  quand tout est rempli, il devient cliquable. Ne clique pas encore : recopie d'abord ta saisie ci-dessous.</w:t>
+            </w:r>
+          </w:p>
+        </w:tc>
+      </w:tr>
+    </w:tbl>
+    <w:p>
+      <w:pPr>
+        <w:spacing w:after="40"/>
+      </w:pPr>
     </w:p>
     <w:p>
       <w:pPr>
@@ -4168,71 +4446,7 @@
                 <w:b/>
                 <w:sz w:val="21"/>
               </w:rPr>
-              <w:t>Pourquoi accepte-t-on quand même une ligne à laquelle il manque des paires, au lieu de tout refuser ?</w:t>
-            </w:r>
-          </w:p>
-          <w:p>
-            <w:pPr>
-              <w:spacing w:before="0" w:after="80"/>
-            </w:pPr>
-            <w:r>
-              <w:rPr>
-                <w:sz w:val="22"/>
-              </w:rPr>
-            </w:r>
-          </w:p>
-          <w:p>
-            <w:pPr>
-              <w:spacing w:before="0" w:after="80"/>
-            </w:pPr>
-            <w:r>
-              <w:rPr>
-                <w:sz w:val="22"/>
-              </w:rPr>
-            </w:r>
-          </w:p>
-          <w:p>
-            <w:pPr>
-              <w:spacing w:before="0" w:after="80"/>
-            </w:pPr>
-            <w:r>
-              <w:rPr>
-                <w:sz w:val="22"/>
-              </w:rPr>
-            </w:r>
-          </w:p>
-          <w:p>
-            <w:pPr>
-              <w:spacing w:before="0" w:after="80"/>
-            </w:pPr>
-            <w:r>
-              <w:rPr>
-                <w:sz w:val="22"/>
-              </w:rPr>
-            </w:r>
-          </w:p>
-        </w:tc>
-      </w:tr>
-      <w:tr>
-        <w:trPr>
-          <w:cantSplit/>
-          <w:trHeight w:val="2438"/>
-        </w:trPr>
-        <w:tc>
-          <w:tcPr>
-            <w:tcW w:type="dxa" w:w="10086"/>
-            <w:shd w:fill="FAFAFA"/>
-          </w:tcPr>
-          <w:p>
-            <w:pPr>
-              <w:spacing w:after="80"/>
-            </w:pPr>
-            <w:r>
-              <w:rPr>
-                <w:b/>
-                <w:sz w:val="21"/>
-              </w:rPr>
-              <w:t>Que se passerait-il, pour l'inventaire, si tu saisissais la quantité annoncée au lieu de la quantité comptée ?</w:t>
+              <w:t>Pour la ligne où il manque des paires, pourquoi as-tu choisi ta décision plutôt qu'une autre ?</w:t>
             </w:r>
           </w:p>
           <w:p>
@@ -4328,7 +4542,7 @@
           <w:color w:val="1A1A1A"/>
           <w:sz w:val="22"/>
         </w:rPr>
-        <w:t>Clique sur « Valider la réception ». Les quantités acceptées entrent en stock, avec leur numéro de lot. Un professionnel ne s'arrête pas là : il vérifie que sa saisie a bien produit ce qu'il attendait.</w:t>
+        <w:t>Clique sur « Valider la réception (entrée en stock) ». Les quantités acceptées entrent en stock, avec leur numéro de lot. Un professionnel ne s'arrête pas là : il vérifie que sa saisie a bien produit ce qu'il attendait.</w:t>
       </w:r>
     </w:p>
     <w:p>
@@ -4414,6 +4628,86 @@
         </w:rPr>
         <w:t>Tape .getlot suivi du numéro de lot : tu vois tout ce qui concerne ce lot.</w:t>
       </w:r>
+    </w:p>
+    <w:tbl>
+      <w:tblPr>
+        <w:tblStyle w:val="TableGrid"/>
+        <w:tblW w:type="auto" w:w="0"/>
+        <w:jc w:val="left"/>
+        <w:tblLook w:firstColumn="1" w:firstRow="1" w:lastColumn="0" w:lastRow="0" w:noHBand="0" w:noVBand="1" w:val="04A0"/>
+      </w:tblPr>
+      <w:tblGrid>
+        <w:gridCol w:w="10086"/>
+      </w:tblGrid>
+      <w:tr>
+        <w:trPr>
+          <w:cantSplit/>
+        </w:trPr>
+        <w:tc>
+          <w:tcPr>
+            <w:tcW w:type="dxa" w:w="10086"/>
+            <w:shd w:fill="F2F2F2"/>
+          </w:tcPr>
+          <w:p>
+            <w:pPr>
+              <w:keepNext/>
+              <w:spacing w:after="40"/>
+            </w:pPr>
+            <w:r>
+              <w:rPr>
+                <w:b/>
+                <w:color w:val="111111"/>
+                <w:sz w:val="20"/>
+              </w:rPr>
+              <w:t>Ce que tu dois voir :</w:t>
+            </w:r>
+          </w:p>
+          <w:p>
+            <w:pPr>
+              <w:keepNext/>
+              <w:spacing w:before="0" w:after="40"/>
+              <w:ind w:left="397" w:hanging="227"/>
+            </w:pPr>
+            <w:r>
+              <w:rPr>
+                <w:sz w:val="20"/>
+              </w:rPr>
+              <w:t>•  après le clic, le message « Réception validée : … entrées en stock » ;</w:t>
+            </w:r>
+          </w:p>
+          <w:p>
+            <w:pPr>
+              <w:keepNext/>
+              <w:spacing w:before="0" w:after="40"/>
+              <w:ind w:left="397" w:hanging="227"/>
+            </w:pPr>
+            <w:r>
+              <w:rPr>
+                <w:sz w:val="20"/>
+              </w:rPr>
+              <w:t>•  le bon de réception ne se modifie plus ;</w:t>
+            </w:r>
+          </w:p>
+          <w:p>
+            <w:pPr>
+              <w:spacing w:before="0" w:after="0"/>
+              <w:ind w:left="397" w:hanging="227"/>
+            </w:pPr>
+            <w:r>
+              <w:rPr>
+                <w:sz w:val="20"/>
+              </w:rPr>
+              <w:t>•  dans la Console, tes entrées, avec le numéro de lot que tu as saisi.</w:t>
+            </w:r>
+          </w:p>
+        </w:tc>
+      </w:tr>
+    </w:tbl>
+    <w:p>
+      <w:pPr>
+        <w:keepNext/>
+        <w:spacing w:after="40"/>
+      </w:pPr>
     </w:p>
     <w:tbl>
       <w:tblPr>
@@ -5230,6 +5524,7 @@
     </w:tbl>
     <w:p>
       <w:pPr>
+        <w:keepNext/>
         <w:spacing w:after="0" w:line="60" w:lineRule="exact"/>
       </w:pPr>
       <w:r>
@@ -5237,6 +5532,72 @@
           <w:sz w:val="10"/>
         </w:rPr>
       </w:r>
+    </w:p>
+    <w:tbl>
+      <w:tblPr>
+        <w:tblStyle w:val="TableGrid"/>
+        <w:tblW w:type="auto" w:w="0"/>
+        <w:jc w:val="left"/>
+        <w:tblLook w:firstColumn="1" w:firstRow="1" w:lastColumn="0" w:lastRow="0" w:noHBand="0" w:noVBand="1" w:val="04A0"/>
+      </w:tblPr>
+      <w:tblGrid>
+        <w:gridCol w:w="10086"/>
+      </w:tblGrid>
+      <w:tr>
+        <w:trPr>
+          <w:cantSplit/>
+        </w:trPr>
+        <w:tc>
+          <w:tcPr>
+            <w:tcW w:type="dxa" w:w="10086"/>
+            <w:shd w:fill="F2F2F2"/>
+          </w:tcPr>
+          <w:p>
+            <w:pPr>
+              <w:keepNext/>
+              <w:spacing w:after="40"/>
+            </w:pPr>
+            <w:r>
+              <w:rPr>
+                <w:b/>
+                <w:color w:val="111111"/>
+                <w:sz w:val="20"/>
+              </w:rPr>
+              <w:t>Tu as terminé la séance quand :</w:t>
+            </w:r>
+          </w:p>
+          <w:p>
+            <w:pPr>
+              <w:keepNext/>
+              <w:spacing w:before="0" w:after="40"/>
+              <w:ind w:left="397" w:hanging="227"/>
+            </w:pPr>
+            <w:r>
+              <w:rPr>
+                <w:sz w:val="20"/>
+              </w:rPr>
+              <w:t>•  ton message à Puma est envoyé ;</w:t>
+            </w:r>
+          </w:p>
+          <w:p>
+            <w:pPr>
+              <w:spacing w:before="0" w:after="0"/>
+              <w:ind w:left="397" w:hanging="227"/>
+            </w:pPr>
+            <w:r>
+              <w:rPr>
+                <w:sz w:val="20"/>
+              </w:rPr>
+              <w:t>•  toutes les questions de ce carnet ont une réponse.</w:t>
+            </w:r>
+          </w:p>
+        </w:tc>
+      </w:tr>
+    </w:tbl>
+    <w:p>
+      <w:pPr>
+        <w:spacing w:after="40"/>
+      </w:pPr>
     </w:p>
     <w:p>
       <w:pPr>
@@ -5268,70 +5629,6 @@
       <w:tblGrid>
         <w:gridCol w:w="10086"/>
       </w:tblGrid>
-      <w:tr>
-        <w:trPr>
-          <w:cantSplit/>
-          <w:trHeight w:val="2438"/>
-        </w:trPr>
-        <w:tc>
-          <w:tcPr>
-            <w:tcW w:type="dxa" w:w="10086"/>
-            <w:shd w:fill="FAFAFA"/>
-          </w:tcPr>
-          <w:p>
-            <w:pPr>
-              <w:spacing w:after="80"/>
-            </w:pPr>
-            <w:r>
-              <w:rPr>
-                <w:b/>
-                <w:sz w:val="21"/>
-              </w:rPr>
-              <w:t>Pourquoi faut-il écrire au fournisseur le jour même, et pas la semaine suivante ?</w:t>
-            </w:r>
-          </w:p>
-          <w:p>
-            <w:pPr>
-              <w:spacing w:before="0" w:after="80"/>
-            </w:pPr>
-            <w:r>
-              <w:rPr>
-                <w:sz w:val="22"/>
-              </w:rPr>
-            </w:r>
-          </w:p>
-          <w:p>
-            <w:pPr>
-              <w:spacing w:before="0" w:after="80"/>
-            </w:pPr>
-            <w:r>
-              <w:rPr>
-                <w:sz w:val="22"/>
-              </w:rPr>
-            </w:r>
-          </w:p>
-          <w:p>
-            <w:pPr>
-              <w:spacing w:before="0" w:after="80"/>
-            </w:pPr>
-            <w:r>
-              <w:rPr>
-                <w:sz w:val="22"/>
-              </w:rPr>
-            </w:r>
-          </w:p>
-          <w:p>
-            <w:pPr>
-              <w:spacing w:before="0" w:after="80"/>
-            </w:pPr>
-            <w:r>
-              <w:rPr>
-                <w:sz w:val="22"/>
-              </w:rPr>
-            </w:r>
-          </w:p>
-        </w:tc>
-      </w:tr>
       <w:tr>
         <w:trPr>
           <w:cantSplit/>
@@ -5407,7 +5704,1263 @@
         </w:rPr>
       </w:r>
     </w:p>
+    <w:p>
+      <w:pPr>
+        <w:sectPr>
+          <w:pgSz w:w="12240" w:h="15840"/>
+          <w:pgMar w:top="680" w:right="1077" w:bottom="737" w:left="1077" w:header="720" w:footer="720" w:gutter="0"/>
+          <w:cols w:space="720"/>
+          <w:docGrid w:linePitch="360"/>
+        </w:sectPr>
+      </w:pPr>
+    </w:p>
+    <w:p>
+      <w:pPr>
+        <w:spacing w:after="40"/>
+      </w:pPr>
+      <w:r>
+        <w:rPr>
+          <w:color w:val="595959"/>
+          <w:sz w:val="18"/>
+        </w:rPr>
+        <w:t>✂  Feuille à détacher et à ranger dans ton classeur</w:t>
+      </w:r>
+    </w:p>
+    <w:p>
+      <w:pPr>
+        <w:spacing w:after="40"/>
+      </w:pPr>
+      <w:r>
+        <w:rPr>
+          <w:b/>
+          <w:color w:val="111111"/>
+          <w:sz w:val="32"/>
+        </w:rPr>
+        <w:t>ENT-1.1 — Le cours : contrôler une livraison</w:t>
+      </w:r>
+    </w:p>
+    <w:p>
+      <w:pPr>
+        <w:keepNext/>
+        <w:spacing w:after="160"/>
+      </w:pPr>
+      <w:r>
+        <w:rPr>
+          <w:color w:val="595959"/>
+          <w:sz w:val="20"/>
+        </w:rPr>
+        <w:t>Compétence C1.4 — Traiter les opérations de réception de produits selon les procédures        Nom : ………………………………        Classe : …………</w:t>
+      </w:r>
+    </w:p>
+    <w:tbl>
+      <w:tblPr>
+        <w:tblStyle w:val="TableGrid"/>
+        <w:tblW w:type="auto" w:w="0"/>
+        <w:jc w:val="left"/>
+        <w:tblLook w:firstColumn="1" w:firstRow="1" w:lastColumn="0" w:lastRow="0" w:noHBand="0" w:noVBand="1" w:val="04A0"/>
+      </w:tblPr>
+      <w:tblGrid>
+        <w:gridCol w:w="10086"/>
+      </w:tblGrid>
+      <w:tr>
+        <w:tc>
+          <w:tcPr>
+            <w:tcW w:type="dxa" w:w="10086"/>
+            <w:shd w:fill="F2F2F2"/>
+          </w:tcPr>
+          <w:p>
+            <w:pPr>
+              <w:spacing w:after="0"/>
+            </w:pPr>
+            <w:r>
+              <w:rPr>
+                <w:b/>
+                <w:color w:val="111111"/>
+                <w:sz w:val="20"/>
+              </w:rPr>
+              <w:t xml:space="preserve">Banque de mots : </w:t>
+            </w:r>
+            <w:r>
+              <w:rPr>
+                <w:sz w:val="20"/>
+              </w:rPr>
+              <w:t>additionne   ·   affiche   ·   annoncé   ·   annoncée   ·   conduit   ·   déchargé   ·   entrée   ·   lot   ·   reçu   ·   vend   ·   vraiment   ·   étiquette</w:t>
+            </w:r>
+          </w:p>
+        </w:tc>
+      </w:tr>
+    </w:tbl>
+    <w:p>
+      <w:pPr>
+        <w:spacing w:after="40"/>
+      </w:pPr>
+    </w:p>
+    <w:p>
+      <w:pPr>
+        <w:keepNext/>
+        <w:spacing w:before="240" w:after="80"/>
+      </w:pPr>
+      <w:r>
+        <w:rPr>
+          <w:b/>
+          <w:color w:val="111111"/>
+          <w:sz w:val="23"/>
+        </w:rPr>
+        <w:t>L'essentiel</w:t>
+      </w:r>
+    </w:p>
+    <w:p>
+      <w:pPr>
+        <w:spacing w:after="140"/>
+        <w:ind w:left="340" w:hanging="340"/>
+      </w:pPr>
+      <w:r>
+        <w:rPr>
+          <w:b/>
+        </w:rPr>
+        <w:t xml:space="preserve">1.  </w:t>
+      </w:r>
+      <w:r>
+        <w:rPr>
+          <w:sz w:val="22"/>
+        </w:rPr>
+        <w:t>On compare toujours ce qui est ………………… sur le bon de livraison à ce qui est réellement arrivé.</w:t>
+      </w:r>
+    </w:p>
+    <w:p>
+      <w:pPr>
+        <w:spacing w:after="140"/>
+        <w:ind w:left="340" w:hanging="340"/>
+      </w:pPr>
+      <w:r>
+        <w:rPr>
+          <w:b/>
+        </w:rPr>
+        <w:t xml:space="preserve">2.  </w:t>
+      </w:r>
+      <w:r>
+        <w:rPr>
+          <w:sz w:val="22"/>
+        </w:rPr>
+        <w:t>Plusieurs colis peuvent contenir la même référence : on les ………………….</w:t>
+      </w:r>
+    </w:p>
+    <w:p>
+      <w:pPr>
+        <w:spacing w:after="140"/>
+        <w:ind w:left="340" w:hanging="340"/>
+      </w:pPr>
+      <w:r>
+        <w:rPr>
+          <w:b/>
+        </w:rPr>
+        <w:t xml:space="preserve">3.  </w:t>
+      </w:r>
+      <w:r>
+        <w:rPr>
+          <w:sz w:val="22"/>
+        </w:rPr>
+        <w:t>Le logiciel ne corrige rien : ce qu'on saisit entre ………………… dans le stock.</w:t>
+      </w:r>
+    </w:p>
+    <w:p>
+      <w:pPr>
+        <w:spacing w:after="140"/>
+        <w:ind w:left="340" w:hanging="340"/>
+      </w:pPr>
+      <w:r>
+        <w:rPr>
+          <w:b/>
+        </w:rPr>
+        <w:t xml:space="preserve">4.  </w:t>
+      </w:r>
+      <w:r>
+        <w:rPr>
+          <w:sz w:val="22"/>
+        </w:rPr>
+        <w:t>Après la validation, on vérifie dans la base que les entrées portent le bon ………………….</w:t>
+      </w:r>
+    </w:p>
+    <w:p>
+      <w:pPr>
+        <w:keepNext/>
+        <w:spacing w:before="240" w:after="80"/>
+      </w:pPr>
+      <w:r>
+        <w:rPr>
+          <w:b/>
+          <w:color w:val="111111"/>
+          <w:sz w:val="23"/>
+        </w:rPr>
+        <w:t>Lexique</w:t>
+      </w:r>
+    </w:p>
+    <w:tbl>
+      <w:tblPr>
+        <w:tblStyle w:val="TableGrid"/>
+        <w:tblW w:type="auto" w:w="0"/>
+        <w:tblLayout w:type="fixed"/>
+        <w:tblLook w:firstColumn="1" w:firstRow="1" w:lastColumn="0" w:lastRow="0" w:noHBand="0" w:noVBand="1" w:val="04A0"/>
+      </w:tblPr>
+      <w:tblGrid>
+        <w:gridCol w:w="2494"/>
+        <w:gridCol w:w="7143"/>
+      </w:tblGrid>
+      <w:tr>
+        <w:tc>
+          <w:tcPr>
+            <w:tcW w:type="dxa" w:w="2494"/>
+            <w:shd w:fill="E8E8E8"/>
+          </w:tcPr>
+          <w:p>
+            <w:pPr>
+              <w:keepNext/>
+              <w:spacing w:after="0"/>
+            </w:pPr>
+            <w:r>
+              <w:rPr>
+                <w:b/>
+                <w:color w:val="111111"/>
+                <w:sz w:val="20"/>
+              </w:rPr>
+              <w:t>Mot</w:t>
+            </w:r>
+          </w:p>
+        </w:tc>
+        <w:tc>
+          <w:tcPr>
+            <w:tcW w:type="dxa" w:w="7143"/>
+            <w:shd w:fill="E8E8E8"/>
+          </w:tcPr>
+          <w:p>
+            <w:pPr>
+              <w:keepNext/>
+              <w:spacing w:after="0"/>
+            </w:pPr>
+            <w:r>
+              <w:rPr>
+                <w:b/>
+                <w:color w:val="111111"/>
+                <w:sz w:val="20"/>
+              </w:rPr>
+              <w:t>Définition (complète avec la banque de mots)</w:t>
+            </w:r>
+          </w:p>
+        </w:tc>
+      </w:tr>
+      <w:tr>
+        <w:trPr>
+          <w:trHeight w:val="595"/>
+        </w:trPr>
+        <w:tc>
+          <w:tcPr>
+            <w:tcW w:type="dxa" w:w="2494"/>
+          </w:tcPr>
+          <w:p>
+            <w:pPr>
+              <w:spacing w:after="0"/>
+            </w:pPr>
+            <w:r>
+              <w:rPr>
+                <w:sz w:val="20"/>
+              </w:rPr>
+              <w:t>Fournisseur</w:t>
+            </w:r>
+          </w:p>
+        </w:tc>
+        <w:tc>
+          <w:tcPr>
+            <w:tcW w:type="dxa" w:w="7143"/>
+          </w:tcPr>
+          <w:p>
+            <w:pPr>
+              <w:spacing w:after="0"/>
+            </w:pPr>
+            <w:r>
+              <w:rPr>
+                <w:sz w:val="20"/>
+              </w:rPr>
+              <w:t>entreprise qui ………………… la marchandise à son client.</w:t>
+            </w:r>
+          </w:p>
+        </w:tc>
+      </w:tr>
+      <w:tr>
+        <w:trPr>
+          <w:trHeight w:val="595"/>
+        </w:trPr>
+        <w:tc>
+          <w:tcPr>
+            <w:tcW w:type="dxa" w:w="2494"/>
+          </w:tcPr>
+          <w:p>
+            <w:pPr>
+              <w:spacing w:after="0"/>
+            </w:pPr>
+            <w:r>
+              <w:rPr>
+                <w:sz w:val="20"/>
+              </w:rPr>
+              <w:t>Transporteur</w:t>
+            </w:r>
+          </w:p>
+        </w:tc>
+        <w:tc>
+          <w:tcPr>
+            <w:tcW w:type="dxa" w:w="7143"/>
+          </w:tcPr>
+          <w:p>
+            <w:pPr>
+              <w:spacing w:after="0"/>
+            </w:pPr>
+            <w:r>
+              <w:rPr>
+                <w:sz w:val="20"/>
+              </w:rPr>
+              <w:t>entreprise qui ………………… la marchandise jusqu'au quai.</w:t>
+            </w:r>
+          </w:p>
+        </w:tc>
+      </w:tr>
+      <w:tr>
+        <w:trPr>
+          <w:trHeight w:val="595"/>
+        </w:trPr>
+        <w:tc>
+          <w:tcPr>
+            <w:tcW w:type="dxa" w:w="2494"/>
+          </w:tcPr>
+          <w:p>
+            <w:pPr>
+              <w:spacing w:after="0"/>
+            </w:pPr>
+            <w:r>
+              <w:rPr>
+                <w:sz w:val="20"/>
+              </w:rPr>
+              <w:t>Quai</w:t>
+            </w:r>
+          </w:p>
+        </w:tc>
+        <w:tc>
+          <w:tcPr>
+            <w:tcW w:type="dxa" w:w="7143"/>
+          </w:tcPr>
+          <w:p>
+            <w:pPr>
+              <w:spacing w:after="0"/>
+            </w:pPr>
+            <w:r>
+              <w:rPr>
+                <w:sz w:val="20"/>
+              </w:rPr>
+              <w:t>endroit où le camion se met, porte ouverte, pour être ………………….</w:t>
+            </w:r>
+          </w:p>
+        </w:tc>
+      </w:tr>
+      <w:tr>
+        <w:trPr>
+          <w:trHeight w:val="595"/>
+        </w:trPr>
+        <w:tc>
+          <w:tcPr>
+            <w:tcW w:type="dxa" w:w="2494"/>
+          </w:tcPr>
+          <w:p>
+            <w:pPr>
+              <w:spacing w:after="0"/>
+            </w:pPr>
+            <w:r>
+              <w:rPr>
+                <w:sz w:val="20"/>
+              </w:rPr>
+              <w:t>Colis</w:t>
+            </w:r>
+          </w:p>
+        </w:tc>
+        <w:tc>
+          <w:tcPr>
+            <w:tcW w:type="dxa" w:w="7143"/>
+          </w:tcPr>
+          <w:p>
+            <w:pPr>
+              <w:spacing w:after="0"/>
+            </w:pPr>
+            <w:r>
+              <w:rPr>
+                <w:sz w:val="20"/>
+              </w:rPr>
+              <w:t>carton ou paquet qui voyage seul, avec une ………………… sur le dessus.</w:t>
+            </w:r>
+          </w:p>
+        </w:tc>
+      </w:tr>
+      <w:tr>
+        <w:trPr>
+          <w:trHeight w:val="595"/>
+        </w:trPr>
+        <w:tc>
+          <w:tcPr>
+            <w:tcW w:type="dxa" w:w="2494"/>
+          </w:tcPr>
+          <w:p>
+            <w:pPr>
+              <w:spacing w:after="0"/>
+            </w:pPr>
+            <w:r>
+              <w:rPr>
+                <w:sz w:val="20"/>
+              </w:rPr>
+              <w:t>Écart de livraison</w:t>
+            </w:r>
+          </w:p>
+        </w:tc>
+        <w:tc>
+          <w:tcPr>
+            <w:tcW w:type="dxa" w:w="7143"/>
+          </w:tcPr>
+          <w:p>
+            <w:pPr>
+              <w:spacing w:after="0"/>
+            </w:pPr>
+            <w:r>
+              <w:rPr>
+                <w:sz w:val="20"/>
+              </w:rPr>
+              <w:t>différence entre la quantité ………………… et la quantité reçue.</w:t>
+            </w:r>
+          </w:p>
+        </w:tc>
+      </w:tr>
+      <w:tr>
+        <w:trPr>
+          <w:trHeight w:val="595"/>
+        </w:trPr>
+        <w:tc>
+          <w:tcPr>
+            <w:tcW w:type="dxa" w:w="2494"/>
+          </w:tcPr>
+          <w:p>
+            <w:pPr>
+              <w:spacing w:after="0"/>
+            </w:pPr>
+            <w:r>
+              <w:rPr>
+                <w:sz w:val="20"/>
+              </w:rPr>
+              <w:t>Bon de réception</w:t>
+            </w:r>
+          </w:p>
+        </w:tc>
+        <w:tc>
+          <w:tcPr>
+            <w:tcW w:type="dxa" w:w="7143"/>
+          </w:tcPr>
+          <w:p>
+            <w:pPr>
+              <w:spacing w:after="0"/>
+            </w:pPr>
+            <w:r>
+              <w:rPr>
+                <w:sz w:val="20"/>
+              </w:rPr>
+              <w:t>document où le réceptionnaire écrit ce qu'il a vraiment ………………… à l'arrivée.</w:t>
+            </w:r>
+          </w:p>
+        </w:tc>
+      </w:tr>
+      <w:tr>
+        <w:trPr>
+          <w:trHeight w:val="595"/>
+        </w:trPr>
+        <w:tc>
+          <w:tcPr>
+            <w:tcW w:type="dxa" w:w="2494"/>
+          </w:tcPr>
+          <w:p>
+            <w:pPr>
+              <w:spacing w:after="0"/>
+            </w:pPr>
+            <w:r>
+              <w:rPr>
+                <w:sz w:val="20"/>
+              </w:rPr>
+              <w:t>Mouvement de stock</w:t>
+            </w:r>
+          </w:p>
+        </w:tc>
+        <w:tc>
+          <w:tcPr>
+            <w:tcW w:type="dxa" w:w="7143"/>
+          </w:tcPr>
+          <w:p>
+            <w:pPr>
+              <w:spacing w:after="0"/>
+            </w:pPr>
+            <w:r>
+              <w:rPr>
+                <w:sz w:val="20"/>
+              </w:rPr>
+              <w:t>toute ………………… ou sortie d'articles, enregistrée par le système.</w:t>
+            </w:r>
+          </w:p>
+        </w:tc>
+      </w:tr>
+      <w:tr>
+        <w:trPr>
+          <w:trHeight w:val="595"/>
+        </w:trPr>
+        <w:tc>
+          <w:tcPr>
+            <w:tcW w:type="dxa" w:w="2494"/>
+          </w:tcPr>
+          <w:p>
+            <w:pPr>
+              <w:spacing w:after="0"/>
+            </w:pPr>
+            <w:r>
+              <w:rPr>
+                <w:sz w:val="20"/>
+              </w:rPr>
+              <w:t>Stock du système</w:t>
+            </w:r>
+          </w:p>
+        </w:tc>
+        <w:tc>
+          <w:tcPr>
+            <w:tcW w:type="dxa" w:w="7143"/>
+          </w:tcPr>
+          <w:p>
+            <w:pPr>
+              <w:spacing w:after="0"/>
+            </w:pPr>
+            <w:r>
+              <w:rPr>
+                <w:sz w:val="20"/>
+              </w:rPr>
+              <w:t>le stock qu'………………… le logiciel, calculé à partir des mouvements enregistrés.</w:t>
+            </w:r>
+          </w:p>
+        </w:tc>
+      </w:tr>
+    </w:tbl>
+    <w:p>
+      <w:pPr>
+        <w:spacing w:after="40"/>
+      </w:pPr>
+    </w:p>
+    <w:p>
+      <w:pPr>
+        <w:pageBreakBefore/>
+        <w:spacing w:after="40"/>
+      </w:pPr>
+      <w:r>
+        <w:rPr>
+          <w:rFonts w:ascii="Consolas" w:hAnsi="Consolas"/>
+          <w:b/>
+          <w:color w:val="595959"/>
+          <w:sz w:val="19"/>
+        </w:rPr>
+        <w:t>À la maison — pour aller plus loin</w:t>
+      </w:r>
+    </w:p>
+    <w:p>
+      <w:pPr>
+        <w:spacing w:after="120"/>
+      </w:pPr>
+      <w:r>
+        <w:rPr>
+          <w:b/>
+          <w:color w:val="111111"/>
+          <w:sz w:val="30"/>
+        </w:rPr>
+        <w:t>La livraison des Baskets du Nord</w:t>
+      </w:r>
+    </w:p>
+    <w:p>
+      <w:pPr>
+        <w:keepNext/>
+        <w:spacing w:before="0" w:after="80"/>
+      </w:pPr>
+      <w:r>
+        <w:rPr>
+          <w:b w:val="0"/>
+          <w:color w:val="1A1A1A"/>
+          <w:sz w:val="22"/>
+        </w:rPr>
+        <w:t>Un fournisseur (inventé pour l'exercice) livre trois références. Voici son bon de livraison et les colis déposés sur le quai.</w:t>
+      </w:r>
+    </w:p>
+    <w:tbl>
+      <w:tblPr>
+        <w:tblStyle w:val="TableGrid"/>
+        <w:tblW w:type="auto" w:w="0"/>
+        <w:jc w:val="left"/>
+        <w:tblLook w:firstColumn="1" w:firstRow="1" w:lastColumn="0" w:lastRow="0" w:noHBand="0" w:noVBand="1" w:val="04A0"/>
+      </w:tblPr>
+      <w:tblGrid>
+        <w:gridCol w:w="10086"/>
+      </w:tblGrid>
+      <w:tr>
+        <w:trPr>
+          <w:cantSplit/>
+        </w:trPr>
+        <w:tc>
+          <w:tcPr>
+            <w:tcW w:type="dxa" w:w="10086"/>
+            <w:shd w:fill="F2F2F2"/>
+          </w:tcPr>
+          <w:p>
+            <w:pPr>
+              <w:keepNext/>
+              <w:spacing w:after="40"/>
+            </w:pPr>
+            <w:r>
+              <w:rPr>
+                <w:b/>
+                <w:color w:val="111111"/>
+                <w:sz w:val="20"/>
+              </w:rPr>
+              <w:t>Bon de livraison BL-5512, lot LOT-BN-0704 :</w:t>
+            </w:r>
+          </w:p>
+          <w:p>
+            <w:pPr>
+              <w:spacing w:before="0" w:after="0"/>
+              <w:ind w:left="397" w:hanging="227"/>
+            </w:pPr>
+            <w:r>
+              <w:rPr>
+                <w:sz w:val="20"/>
+              </w:rPr>
+              <w:t>•  BK-RUN-40 : 10 paires · BK-RUN-42 : 6 paires · BK-TRL-41 : 8 paires.</w:t>
+            </w:r>
+          </w:p>
+        </w:tc>
+      </w:tr>
+    </w:tbl>
+    <w:p>
+      <w:pPr>
+        <w:keepNext/>
+        <w:spacing w:after="40"/>
+      </w:pPr>
+    </w:p>
+    <w:tbl>
+      <w:tblPr>
+        <w:tblStyle w:val="TableGrid"/>
+        <w:tblW w:type="auto" w:w="0"/>
+        <w:jc w:val="left"/>
+        <w:tblLook w:firstColumn="1" w:firstRow="1" w:lastColumn="0" w:lastRow="0" w:noHBand="0" w:noVBand="1" w:val="04A0"/>
+      </w:tblPr>
+      <w:tblGrid>
+        <w:gridCol w:w="10086"/>
+      </w:tblGrid>
+      <w:tr>
+        <w:trPr>
+          <w:cantSplit/>
+        </w:trPr>
+        <w:tc>
+          <w:tcPr>
+            <w:tcW w:type="dxa" w:w="10086"/>
+            <w:shd w:fill="F2F2F2"/>
+          </w:tcPr>
+          <w:p>
+            <w:pPr>
+              <w:keepNext/>
+              <w:spacing w:after="40"/>
+            </w:pPr>
+            <w:r>
+              <w:rPr>
+                <w:b/>
+                <w:color w:val="111111"/>
+                <w:sz w:val="20"/>
+              </w:rPr>
+              <w:t>Colis sur le quai :</w:t>
+            </w:r>
+          </w:p>
+          <w:p>
+            <w:pPr>
+              <w:keepNext/>
+              <w:spacing w:before="0" w:after="40"/>
+              <w:ind w:left="397" w:hanging="227"/>
+            </w:pPr>
+            <w:r>
+              <w:rPr>
+                <w:sz w:val="20"/>
+              </w:rPr>
+              <w:t>•  colis 1 : BK-RUN-40, 5 paires, carton en bon état ;</w:t>
+            </w:r>
+          </w:p>
+          <w:p>
+            <w:pPr>
+              <w:keepNext/>
+              <w:spacing w:before="0" w:after="40"/>
+              <w:ind w:left="397" w:hanging="227"/>
+            </w:pPr>
+            <w:r>
+              <w:rPr>
+                <w:sz w:val="20"/>
+              </w:rPr>
+              <w:t>•  colis 2 : BK-RUN-40, 5 paires, carton en bon état ;</w:t>
+            </w:r>
+          </w:p>
+          <w:p>
+            <w:pPr>
+              <w:keepNext/>
+              <w:spacing w:before="0" w:after="40"/>
+              <w:ind w:left="397" w:hanging="227"/>
+            </w:pPr>
+            <w:r>
+              <w:rPr>
+                <w:sz w:val="20"/>
+              </w:rPr>
+              <w:t>•  colis 3 : BK-RUN-42, 4 paires, carton en bon état ;</w:t>
+            </w:r>
+          </w:p>
+          <w:p>
+            <w:pPr>
+              <w:spacing w:before="0" w:after="0"/>
+              <w:ind w:left="397" w:hanging="227"/>
+            </w:pPr>
+            <w:r>
+              <w:rPr>
+                <w:sz w:val="20"/>
+              </w:rPr>
+              <w:t>•  colis 4 : BK-TRL-41, 8 paires, carton mouillé.</w:t>
+            </w:r>
+          </w:p>
+        </w:tc>
+      </w:tr>
+    </w:tbl>
+    <w:p>
+      <w:pPr>
+        <w:keepNext/>
+        <w:spacing w:after="40"/>
+      </w:pPr>
+    </w:p>
+    <w:tbl>
+      <w:tblPr>
+        <w:tblStyle w:val="TableGrid"/>
+        <w:tblW w:type="auto" w:w="0"/>
+        <w:jc w:val="left"/>
+        <w:tblLook w:firstColumn="1" w:firstRow="1" w:lastColumn="0" w:lastRow="0" w:noHBand="0" w:noVBand="1" w:val="04A0"/>
+      </w:tblPr>
+      <w:tblGrid>
+        <w:gridCol w:w="10086"/>
+      </w:tblGrid>
+      <w:tr>
+        <w:tc>
+          <w:tcPr>
+            <w:tcW w:type="dxa" w:w="10086"/>
+            <w:shd w:fill="F2F2F2"/>
+          </w:tcPr>
+          <w:p>
+            <w:pPr>
+              <w:spacing w:after="0"/>
+            </w:pPr>
+            <w:r>
+              <w:rPr>
+                <w:b/>
+                <w:color w:val="111111"/>
+                <w:sz w:val="20"/>
+              </w:rPr>
+              <w:t xml:space="preserve">Règle : </w:t>
+            </w:r>
+            <w:r>
+              <w:rPr>
+                <w:sz w:val="20"/>
+              </w:rPr>
+              <w:t>écart de quantité ou carton abîmé → accepté sous réserve ; on ne refuse que si la marchandise est inutilisable.</w:t>
+            </w:r>
+          </w:p>
+        </w:tc>
+      </w:tr>
+    </w:tbl>
+    <w:p>
+      <w:pPr>
+        <w:keepNext/>
+        <w:spacing w:after="40"/>
+      </w:pPr>
+    </w:p>
+    <w:tbl>
+      <w:tblPr>
+        <w:tblStyle w:val="TableGrid"/>
+        <w:tblW w:type="auto" w:w="0"/>
+        <w:tblLayout w:type="fixed"/>
+        <w:tblLook w:firstColumn="1" w:firstRow="1" w:lastColumn="0" w:lastRow="0" w:noHBand="0" w:noVBand="1" w:val="04A0"/>
+      </w:tblPr>
+      <w:tblGrid>
+        <w:gridCol w:w="1814"/>
+        <w:gridCol w:w="1247"/>
+        <w:gridCol w:w="1247"/>
+        <w:gridCol w:w="1134"/>
+        <w:gridCol w:w="1928"/>
+        <w:gridCol w:w="2268"/>
+      </w:tblGrid>
+      <w:tr>
+        <w:tc>
+          <w:tcPr>
+            <w:tcW w:type="dxa" w:w="1814"/>
+            <w:shd w:fill="E8E8E8"/>
+          </w:tcPr>
+          <w:p>
+            <w:pPr>
+              <w:keepNext/>
+              <w:spacing w:after="0"/>
+            </w:pPr>
+            <w:r>
+              <w:rPr>
+                <w:b/>
+                <w:color w:val="111111"/>
+                <w:sz w:val="20"/>
+              </w:rPr>
+              <w:t>Référence</w:t>
+            </w:r>
+          </w:p>
+        </w:tc>
+        <w:tc>
+          <w:tcPr>
+            <w:tcW w:type="dxa" w:w="1247"/>
+            <w:shd w:fill="E8E8E8"/>
+          </w:tcPr>
+          <w:p>
+            <w:pPr>
+              <w:keepNext/>
+              <w:spacing w:after="0"/>
+            </w:pPr>
+            <w:r>
+              <w:rPr>
+                <w:b/>
+                <w:color w:val="111111"/>
+                <w:sz w:val="20"/>
+              </w:rPr>
+              <w:t>Annoncé</w:t>
+            </w:r>
+          </w:p>
+        </w:tc>
+        <w:tc>
+          <w:tcPr>
+            <w:tcW w:type="dxa" w:w="1247"/>
+            <w:shd w:fill="E8E8E8"/>
+          </w:tcPr>
+          <w:p>
+            <w:pPr>
+              <w:keepNext/>
+              <w:spacing w:after="0"/>
+            </w:pPr>
+            <w:r>
+              <w:rPr>
+                <w:b/>
+                <w:color w:val="111111"/>
+                <w:sz w:val="20"/>
+              </w:rPr>
+              <w:t>Compté</w:t>
+            </w:r>
+          </w:p>
+        </w:tc>
+        <w:tc>
+          <w:tcPr>
+            <w:tcW w:type="dxa" w:w="1134"/>
+            <w:shd w:fill="E8E8E8"/>
+          </w:tcPr>
+          <w:p>
+            <w:pPr>
+              <w:keepNext/>
+              <w:spacing w:after="0"/>
+            </w:pPr>
+            <w:r>
+              <w:rPr>
+                <w:b/>
+                <w:color w:val="111111"/>
+                <w:sz w:val="20"/>
+              </w:rPr>
+              <w:t>Écart</w:t>
+            </w:r>
+          </w:p>
+        </w:tc>
+        <w:tc>
+          <w:tcPr>
+            <w:tcW w:type="dxa" w:w="1928"/>
+            <w:shd w:fill="E8E8E8"/>
+          </w:tcPr>
+          <w:p>
+            <w:pPr>
+              <w:keepNext/>
+              <w:spacing w:after="0"/>
+            </w:pPr>
+            <w:r>
+              <w:rPr>
+                <w:b/>
+                <w:color w:val="111111"/>
+                <w:sz w:val="20"/>
+              </w:rPr>
+              <w:t>État</w:t>
+            </w:r>
+          </w:p>
+        </w:tc>
+        <w:tc>
+          <w:tcPr>
+            <w:tcW w:type="dxa" w:w="2268"/>
+            <w:shd w:fill="E8E8E8"/>
+          </w:tcPr>
+          <w:p>
+            <w:pPr>
+              <w:keepNext/>
+              <w:spacing w:after="0"/>
+            </w:pPr>
+            <w:r>
+              <w:rPr>
+                <w:b/>
+                <w:color w:val="111111"/>
+                <w:sz w:val="20"/>
+              </w:rPr>
+              <w:t>Décision</w:t>
+            </w:r>
+          </w:p>
+        </w:tc>
+      </w:tr>
+      <w:tr>
+        <w:trPr>
+          <w:trHeight w:val="567"/>
+        </w:trPr>
+        <w:tc>
+          <w:tcPr>
+            <w:tcW w:type="dxa" w:w="1814"/>
+          </w:tcPr>
+          <w:p>
+            <w:pPr>
+              <w:spacing w:after="0"/>
+            </w:pPr>
+            <w:r>
+              <w:rPr>
+                <w:sz w:val="20"/>
+              </w:rPr>
+              <w:t>BK-RUN-40</w:t>
+            </w:r>
+          </w:p>
+        </w:tc>
+        <w:tc>
+          <w:tcPr>
+            <w:tcW w:type="dxa" w:w="1247"/>
+          </w:tcPr>
+          <w:p/>
+        </w:tc>
+        <w:tc>
+          <w:tcPr>
+            <w:tcW w:type="dxa" w:w="1247"/>
+          </w:tcPr>
+          <w:p/>
+        </w:tc>
+        <w:tc>
+          <w:tcPr>
+            <w:tcW w:type="dxa" w:w="1134"/>
+          </w:tcPr>
+          <w:p/>
+        </w:tc>
+        <w:tc>
+          <w:tcPr>
+            <w:tcW w:type="dxa" w:w="1928"/>
+          </w:tcPr>
+          <w:p/>
+        </w:tc>
+        <w:tc>
+          <w:tcPr>
+            <w:tcW w:type="dxa" w:w="2268"/>
+          </w:tcPr>
+          <w:p/>
+        </w:tc>
+      </w:tr>
+      <w:tr>
+        <w:trPr>
+          <w:trHeight w:val="567"/>
+        </w:trPr>
+        <w:tc>
+          <w:tcPr>
+            <w:tcW w:type="dxa" w:w="1814"/>
+          </w:tcPr>
+          <w:p>
+            <w:pPr>
+              <w:spacing w:after="0"/>
+            </w:pPr>
+            <w:r>
+              <w:rPr>
+                <w:sz w:val="20"/>
+              </w:rPr>
+              <w:t>BK-RUN-42</w:t>
+            </w:r>
+          </w:p>
+        </w:tc>
+        <w:tc>
+          <w:tcPr>
+            <w:tcW w:type="dxa" w:w="1247"/>
+          </w:tcPr>
+          <w:p/>
+        </w:tc>
+        <w:tc>
+          <w:tcPr>
+            <w:tcW w:type="dxa" w:w="1247"/>
+          </w:tcPr>
+          <w:p/>
+        </w:tc>
+        <w:tc>
+          <w:tcPr>
+            <w:tcW w:type="dxa" w:w="1134"/>
+          </w:tcPr>
+          <w:p/>
+        </w:tc>
+        <w:tc>
+          <w:tcPr>
+            <w:tcW w:type="dxa" w:w="1928"/>
+          </w:tcPr>
+          <w:p/>
+        </w:tc>
+        <w:tc>
+          <w:tcPr>
+            <w:tcW w:type="dxa" w:w="2268"/>
+          </w:tcPr>
+          <w:p/>
+        </w:tc>
+      </w:tr>
+      <w:tr>
+        <w:trPr>
+          <w:trHeight w:val="567"/>
+        </w:trPr>
+        <w:tc>
+          <w:tcPr>
+            <w:tcW w:type="dxa" w:w="1814"/>
+          </w:tcPr>
+          <w:p>
+            <w:pPr>
+              <w:spacing w:after="0"/>
+            </w:pPr>
+            <w:r>
+              <w:rPr>
+                <w:sz w:val="20"/>
+              </w:rPr>
+              <w:t>BK-TRL-41</w:t>
+            </w:r>
+          </w:p>
+        </w:tc>
+        <w:tc>
+          <w:tcPr>
+            <w:tcW w:type="dxa" w:w="1247"/>
+          </w:tcPr>
+          <w:p/>
+        </w:tc>
+        <w:tc>
+          <w:tcPr>
+            <w:tcW w:type="dxa" w:w="1247"/>
+          </w:tcPr>
+          <w:p/>
+        </w:tc>
+        <w:tc>
+          <w:tcPr>
+            <w:tcW w:type="dxa" w:w="1134"/>
+          </w:tcPr>
+          <w:p/>
+        </w:tc>
+        <w:tc>
+          <w:tcPr>
+            <w:tcW w:type="dxa" w:w="1928"/>
+          </w:tcPr>
+          <w:p/>
+        </w:tc>
+        <w:tc>
+          <w:tcPr>
+            <w:tcW w:type="dxa" w:w="2268"/>
+          </w:tcPr>
+          <w:p/>
+        </w:tc>
+      </w:tr>
+    </w:tbl>
+    <w:p>
+      <w:pPr>
+        <w:keepNext/>
+        <w:spacing w:after="40"/>
+      </w:pPr>
+    </w:p>
+    <w:tbl>
+      <w:tblPr>
+        <w:tblStyle w:val="TableGrid"/>
+        <w:tblW w:type="auto" w:w="0"/>
+        <w:tblLook w:firstColumn="1" w:firstRow="1" w:lastColumn="0" w:lastRow="0" w:noHBand="0" w:noVBand="1" w:val="04A0"/>
+      </w:tblPr>
+      <w:tblGrid>
+        <w:gridCol w:w="10086"/>
+      </w:tblGrid>
+      <w:tr>
+        <w:trPr>
+          <w:cantSplit/>
+          <w:trHeight w:val="1956"/>
+        </w:trPr>
+        <w:tc>
+          <w:tcPr>
+            <w:tcW w:type="dxa" w:w="10086"/>
+            <w:shd w:fill="FAFAFA"/>
+          </w:tcPr>
+          <w:p>
+            <w:pPr>
+              <w:spacing w:after="80"/>
+            </w:pPr>
+            <w:r>
+              <w:rPr>
+                <w:b/>
+                <w:sz w:val="21"/>
+              </w:rPr>
+              <w:t>Écris en deux phrases ton message de réserves au fournisseur.</w:t>
+            </w:r>
+          </w:p>
+          <w:p>
+            <w:pPr>
+              <w:spacing w:before="0" w:after="80"/>
+            </w:pPr>
+            <w:r>
+              <w:rPr>
+                <w:sz w:val="22"/>
+              </w:rPr>
+            </w:r>
+          </w:p>
+          <w:p>
+            <w:pPr>
+              <w:spacing w:before="0" w:after="80"/>
+            </w:pPr>
+            <w:r>
+              <w:rPr>
+                <w:sz w:val="22"/>
+              </w:rPr>
+            </w:r>
+          </w:p>
+          <w:p>
+            <w:pPr>
+              <w:spacing w:before="0" w:after="80"/>
+            </w:pPr>
+            <w:r>
+              <w:rPr>
+                <w:sz w:val="22"/>
+              </w:rPr>
+            </w:r>
+          </w:p>
+        </w:tc>
+      </w:tr>
+    </w:tbl>
+    <w:p>
+      <w:pPr>
+        <w:spacing w:after="0" w:line="60" w:lineRule="exact"/>
+      </w:pPr>
+      <w:r>
+        <w:rPr>
+          <w:sz w:val="10"/>
+        </w:rPr>
+      </w:r>
+    </w:p>
+    <w:p>
+      <w:pPr>
+        <w:keepNext/>
+        <w:spacing w:before="160" w:after="80"/>
+      </w:pPr>
+      <w:r>
+        <w:rPr>
+          <w:b/>
+          <w:color w:val="111111"/>
+          <w:sz w:val="23"/>
+        </w:rPr>
+        <w:t>Pour réfléchir</w:t>
+      </w:r>
+      <w:r>
+        <w:rPr>
+          <w:color w:val="595959"/>
+          <w:sz w:val="19"/>
+        </w:rPr>
+        <w:t xml:space="preserve">   Il n'y a pas une seule bonne réponse : explique la tienne, avec tes mots.</w:t>
+      </w:r>
+    </w:p>
+    <w:tbl>
+      <w:tblPr>
+        <w:tblStyle w:val="TableGrid"/>
+        <w:tblW w:type="auto" w:w="0"/>
+        <w:tblLook w:firstColumn="1" w:firstRow="1" w:lastColumn="0" w:lastRow="0" w:noHBand="0" w:noVBand="1" w:val="04A0"/>
+      </w:tblPr>
+      <w:tblGrid>
+        <w:gridCol w:w="10086"/>
+      </w:tblGrid>
+      <w:tr>
+        <w:trPr>
+          <w:cantSplit/>
+          <w:trHeight w:val="2438"/>
+        </w:trPr>
+        <w:tc>
+          <w:tcPr>
+            <w:tcW w:type="dxa" w:w="10086"/>
+            <w:shd w:fill="FAFAFA"/>
+          </w:tcPr>
+          <w:p>
+            <w:pPr>
+              <w:spacing w:after="80"/>
+            </w:pPr>
+            <w:r>
+              <w:rPr>
+                <w:b/>
+                <w:sz w:val="21"/>
+              </w:rPr>
+              <w:t>Le chauffeur est pressé et te demande de signer sans compter. Que lui réponds-tu ?</w:t>
+            </w:r>
+          </w:p>
+          <w:p>
+            <w:pPr>
+              <w:spacing w:before="0" w:after="80"/>
+            </w:pPr>
+            <w:r>
+              <w:rPr>
+                <w:sz w:val="22"/>
+              </w:rPr>
+            </w:r>
+          </w:p>
+          <w:p>
+            <w:pPr>
+              <w:spacing w:before="0" w:after="80"/>
+            </w:pPr>
+            <w:r>
+              <w:rPr>
+                <w:sz w:val="22"/>
+              </w:rPr>
+            </w:r>
+          </w:p>
+          <w:p>
+            <w:pPr>
+              <w:spacing w:before="0" w:after="80"/>
+            </w:pPr>
+            <w:r>
+              <w:rPr>
+                <w:sz w:val="22"/>
+              </w:rPr>
+            </w:r>
+          </w:p>
+          <w:p>
+            <w:pPr>
+              <w:spacing w:before="0" w:after="80"/>
+            </w:pPr>
+            <w:r>
+              <w:rPr>
+                <w:sz w:val="22"/>
+              </w:rPr>
+            </w:r>
+          </w:p>
+        </w:tc>
+      </w:tr>
+    </w:tbl>
+    <w:p>
+      <w:pPr>
+        <w:spacing w:after="0" w:line="60" w:lineRule="exact"/>
+      </w:pPr>
+      <w:r>
+        <w:rPr>
+          <w:sz w:val="10"/>
+        </w:rPr>
+      </w:r>
+    </w:p>
     <w:sectPr>
+      <w:type w:val="oddPage"/>
       <w:pgSz w:w="12240" w:h="15840"/>
       <w:pgMar w:top="680" w:right="1077" w:bottom="737" w:left="1077" w:header="720" w:footer="720" w:gutter="0"/>
       <w:cols w:space="720"/>

</xml_diff>

<commit_message>
Trames élève : logo Simulog en tête de la page 1
Les 14 trames (Word et PDF) portent le logo Simulog à gauche à la place
du rond Prepalog et du mot « Simulog » tapé ; logo de l'entreprise inchangé.

Co-Authored-By: Claude Opus 5.5 <noreply@anthropic.com>
</commit_message>
<xml_diff>
--- a/contenus/trames/ENT-1.1-spartoo-reception-trame-eleve.docx
+++ b/contenus/trames/ENT-1.1-spartoo-reception-trame-eleve.docx
@@ -12,7 +12,7 @@
       <w:r>
         <w:drawing>
           <wp:inline xmlns:a="http://schemas.openxmlformats.org/drawingml/2006/main" xmlns:pic="http://schemas.openxmlformats.org/drawingml/2006/picture">
-            <wp:extent cx="413999" cy="413999"/>
+            <wp:extent cx="1861364" cy="468000"/>
             <wp:docPr id="1" name="Picture 1"/>
             <wp:cNvGraphicFramePr>
               <a:graphicFrameLocks noChangeAspect="1"/>
@@ -21,7 +21,7 @@
               <a:graphicData uri="http://schemas.openxmlformats.org/drawingml/2006/picture">
                 <pic:pic>
                   <pic:nvPicPr>
-                    <pic:cNvPr id="0" name="logo.png"/>
+                    <pic:cNvPr id="0" name="simulog.png"/>
                     <pic:cNvPicPr/>
                   </pic:nvPicPr>
                   <pic:blipFill>
@@ -33,7 +33,7 @@
                   <pic:spPr>
                     <a:xfrm>
                       <a:off x="0" y="0"/>
-                      <a:ext cx="413999" cy="413999"/>
+                      <a:ext cx="1861364" cy="468000"/>
                     </a:xfrm>
                     <a:prstGeom prst="rect"/>
                   </pic:spPr>
@@ -42,14 +42,6 @@
             </a:graphic>
           </wp:inline>
         </w:drawing>
-      </w:r>
-      <w:r>
-        <w:rPr>
-          <w:b/>
-          <w:color w:val="111111"/>
-          <w:sz w:val="40"/>
-        </w:rPr>
-        <w:t xml:space="preserve">  Simulog</w:t>
       </w:r>
       <w:r>
         <w:tab/>

</xml_diff>